<commit_message>
fix(latex-engine): enable auto tectonic download and python3 resolution on deployed Linux environments
</commit_message>
<xml_diff>
--- a/Consolidated_Institutional_HOD_Report_September_2026.docx
+++ b/Consolidated_Institutional_HOD_Report_September_2026.docx
@@ -35,7 +35,7 @@
           <w:color w:val="475569"/>
           <w:sz w:val="17"/>
         </w:rPr>
-        <w:t>Reporting Period: September 2026  |  Participating Entities: CSE</w:t>
+        <w:t xml:space="preserve">Reporting Period: September 2026  |  Participating Entities: </w:t>
       </w:r>
     </w:p>
     <w:p>
@@ -300,11 +300,10 @@
             </w:pPr>
             <w:r>
               <w:rPr>
-                <w:b/>
-                <w:color w:val="1E3A8A"/>
+                <w:color w:val="94A3B8"/>
                 <w:sz w:val="17"/>
               </w:rPr>
-              <w:t>1</w:t>
+              <w:t>-</w:t>
             </w:r>
           </w:p>
         </w:tc>
@@ -395,7 +394,7 @@
                 <w:color w:val="C2410C"/>
                 <w:sz w:val="17"/>
               </w:rPr>
-              <w:t>1</w:t>
+              <w:t>0</w:t>
             </w:r>
           </w:p>
         </w:tc>
@@ -449,11 +448,10 @@
             </w:pPr>
             <w:r>
               <w:rPr>
-                <w:b/>
-                <w:color w:val="1E3A8A"/>
+                <w:color w:val="94A3B8"/>
                 <w:sz w:val="17"/>
               </w:rPr>
-              <w:t>1</w:t>
+              <w:t>-</w:t>
             </w:r>
           </w:p>
         </w:tc>
@@ -544,7 +542,7 @@
                 <w:color w:val="C2410C"/>
                 <w:sz w:val="17"/>
               </w:rPr>
-              <w:t>1</w:t>
+              <w:t>0</w:t>
             </w:r>
           </w:p>
         </w:tc>
@@ -598,11 +596,10 @@
             </w:pPr>
             <w:r>
               <w:rPr>
-                <w:b/>
-                <w:color w:val="1E3A8A"/>
+                <w:color w:val="94A3B8"/>
                 <w:sz w:val="17"/>
               </w:rPr>
-              <w:t>1</w:t>
+              <w:t>-</w:t>
             </w:r>
           </w:p>
         </w:tc>
@@ -693,7 +690,7 @@
                 <w:color w:val="C2410C"/>
                 <w:sz w:val="17"/>
               </w:rPr>
-              <w:t>1</w:t>
+              <w:t>0</w:t>
             </w:r>
           </w:p>
         </w:tc>
@@ -2676,7 +2673,7 @@
                 <w:color w:val="1E3A8A"/>
                 <w:sz w:val="17"/>
               </w:rPr>
-              <w:t>3</w:t>
+              <w:t>0</w:t>
             </w:r>
           </w:p>
         </w:tc>
@@ -2771,7 +2768,7 @@
                 <w:color w:val="C2410C"/>
                 <w:sz w:val="18"/>
               </w:rPr>
-              <w:t>3</w:t>
+              <w:t>0</w:t>
             </w:r>
           </w:p>
         </w:tc>
@@ -2944,7 +2941,7 @@
               <w:jc w:val="center"/>
             </w:pPr>
             <w:r>
-              <w:t>1</w:t>
+              <w:t>NIL</w:t>
             </w:r>
           </w:p>
         </w:tc>
@@ -2958,10 +2955,7 @@
               <w:jc w:val="center"/>
             </w:pPr>
             <w:r>
-              <w:rPr>
-                <w:b/>
-              </w:rPr>
-              <w:t>CSE</w:t>
+              <w:t>NIL</w:t>
             </w:r>
           </w:p>
         </w:tc>
@@ -2972,17 +2966,10 @@
           </w:tcPr>
           <w:p>
             <w:pPr>
-              <w:spacing w:before="20" w:after="20" w:line="276" w:lineRule="auto"/>
-              <w:jc w:val="left"/>
-            </w:pPr>
-            <w:r/>
-            <w:r>
-              <w:rPr>
-                <w:b w:val="0"/>
-                <w:color w:val="0F172A"/>
-                <w:sz w:val="17"/>
-              </w:rPr>
-              <w:t>Optimized Federated Learning for Edge IoT Devices</w:t>
+              <w:jc w:val="center"/>
+            </w:pPr>
+            <w:r>
+              <w:t>NIL</w:t>
             </w:r>
           </w:p>
         </w:tc>
@@ -2993,69 +2980,10 @@
           </w:tcPr>
           <w:p>
             <w:pPr>
-              <w:spacing w:before="20" w:after="20" w:line="276" w:lineRule="auto"/>
-              <w:jc w:val="left"/>
-            </w:pPr>
-            <w:r/>
-            <w:r>
-              <w:rPr>
-                <w:b/>
-                <w:color w:val="1E3A8A"/>
-                <w:sz w:val="16"/>
-              </w:rPr>
-              <w:t xml:space="preserve">Authors: </w:t>
-            </w:r>
-            <w:r>
-              <w:rPr>
-                <w:b w:val="0"/>
-                <w:color w:val="334155"/>
-                <w:sz w:val="16"/>
-              </w:rPr>
-              <w:t>Dr. Vinod Kumar, P. Sreenivasulu</w:t>
-            </w:r>
-          </w:p>
-          <w:p>
-            <w:pPr>
-              <w:spacing w:before="20" w:after="20" w:line="276" w:lineRule="auto"/>
-              <w:jc w:val="left"/>
-            </w:pPr>
-            <w:r>
-              <w:rPr>
-                <w:b/>
-                <w:color w:val="1E3A8A"/>
-                <w:sz w:val="16"/>
-              </w:rPr>
-              <w:t xml:space="preserve">Journal: </w:t>
-            </w:r>
-            <w:r>
-              <w:rPr>
-                <w:b w:val="0"/>
-                <w:color w:val="475569"/>
-                <w:sz w:val="16"/>
-              </w:rPr>
-              <w:t>IEEE Transactions on Network Science (Vol. 14, Issue 3, 2026)</w:t>
-            </w:r>
-          </w:p>
-          <w:p>
-            <w:pPr>
-              <w:spacing w:before="20" w:after="20" w:line="276" w:lineRule="auto"/>
-              <w:jc w:val="left"/>
-            </w:pPr>
-            <w:r>
-              <w:rPr>
-                <w:b/>
-                <w:color w:val="1E3A8A"/>
-                <w:sz w:val="16"/>
-              </w:rPr>
-              <w:t xml:space="preserve">Pages: </w:t>
-            </w:r>
-            <w:r>
-              <w:rPr>
-                <w:b w:val="0"/>
-                <w:color w:val="64748B"/>
-                <w:sz w:val="16"/>
-              </w:rPr>
-              <w:t>112-124</w:t>
+              <w:jc w:val="center"/>
+            </w:pPr>
+            <w:r>
+              <w:t>NIL</w:t>
             </w:r>
           </w:p>
         </w:tc>
@@ -3066,61 +2994,10 @@
           </w:tcPr>
           <w:p>
             <w:pPr>
-              <w:spacing w:before="20" w:after="20" w:line="276" w:lineRule="auto"/>
-              <w:jc w:val="left"/>
-            </w:pPr>
-            <w:r/>
-            <w:r>
-              <w:rPr>
-                <w:b/>
-                <w:color w:val="1E3A8A"/>
-                <w:sz w:val="16"/>
-              </w:rPr>
-              <w:t xml:space="preserve">ISSN: </w:t>
-            </w:r>
-            <w:r>
-              <w:rPr>
-                <w:b w:val="0"/>
-                <w:color w:val="334155"/>
-                <w:sz w:val="16"/>
-              </w:rPr>
-              <w:t>2325-5382</w:t>
-            </w:r>
-          </w:p>
-          <w:p>
-            <w:pPr>
-              <w:spacing w:before="20" w:after="20" w:line="276" w:lineRule="auto"/>
-              <w:jc w:val="left"/>
-            </w:pPr>
-            <w:r>
-              <w:rPr>
-                <w:b/>
-                <w:color w:val="1E3A8A"/>
-                <w:sz w:val="16"/>
-              </w:rPr>
-              <w:t xml:space="preserve">Indexed: </w:t>
-            </w:r>
-            <w:r>
-              <w:rPr>
-                <w:b/>
-                <w:color w:val="1E3A8A"/>
-                <w:sz w:val="16"/>
-              </w:rPr>
-              <w:t>Scopus &amp; WoS</w:t>
-            </w:r>
-          </w:p>
-          <w:p>
-            <w:pPr>
-              <w:spacing w:before="20" w:after="20" w:line="276" w:lineRule="auto"/>
-              <w:jc w:val="left"/>
-            </w:pPr>
-            <w:r>
-              <w:rPr>
-                <w:b w:val="0"/>
-                <w:color w:val="2563EB"/>
-                <w:sz w:val="16"/>
-              </w:rPr>
-              <w:t>https://ieeexplore.ieee.org/document/123456</w:t>
+              <w:jc w:val="center"/>
+            </w:pPr>
+            <w:r>
+              <w:t>NIL</w:t>
             </w:r>
           </w:p>
         </w:tc>
@@ -3292,7 +3169,7 @@
               <w:jc w:val="center"/>
             </w:pPr>
             <w:r>
-              <w:t>1</w:t>
+              <w:t>NIL</w:t>
             </w:r>
           </w:p>
         </w:tc>
@@ -3306,10 +3183,7 @@
               <w:jc w:val="center"/>
             </w:pPr>
             <w:r>
-              <w:rPr>
-                <w:b/>
-              </w:rPr>
-              <w:t>CSE</w:t>
+              <w:t>NIL</w:t>
             </w:r>
           </w:p>
         </w:tc>
@@ -3320,17 +3194,10 @@
           </w:tcPr>
           <w:p>
             <w:pPr>
-              <w:spacing w:before="20" w:after="20" w:line="276" w:lineRule="auto"/>
-              <w:jc w:val="left"/>
-            </w:pPr>
-            <w:r/>
-            <w:r>
-              <w:rPr>
-                <w:b w:val="0"/>
-                <w:color w:val="0F172A"/>
-                <w:sz w:val="17"/>
-              </w:rPr>
-              <w:t>Adaptive Vision Transformers in Edge Analytics</w:t>
+              <w:jc w:val="center"/>
+            </w:pPr>
+            <w:r>
+              <w:t>NIL</w:t>
             </w:r>
           </w:p>
         </w:tc>
@@ -3341,47 +3208,10 @@
           </w:tcPr>
           <w:p>
             <w:pPr>
-              <w:spacing w:before="20" w:after="20" w:line="276" w:lineRule="auto"/>
-              <w:jc w:val="left"/>
-            </w:pPr>
-            <w:r/>
-            <w:r>
-              <w:rPr>
-                <w:b/>
-                <w:color w:val="1E3A8A"/>
-                <w:sz w:val="16"/>
-              </w:rPr>
-              <w:t xml:space="preserve">Authors: </w:t>
-            </w:r>
-            <w:r>
-              <w:rPr>
-                <w:b w:val="0"/>
-                <w:color w:val="334155"/>
-                <w:sz w:val="16"/>
-              </w:rPr>
-              <w:t>Dr. Vinod Kumar, K. Raghavendra</w:t>
-            </w:r>
-          </w:p>
-          <w:p>
-            <w:pPr>
-              <w:spacing w:before="20" w:after="20" w:line="276" w:lineRule="auto"/>
-              <w:jc w:val="left"/>
-            </w:pPr>
-            <w:r>
-              <w:rPr>
-                <w:b/>
-                <w:color w:val="1E3A8A"/>
-                <w:sz w:val="16"/>
-              </w:rPr>
-              <w:t xml:space="preserve">Conference: </w:t>
-            </w:r>
-            <w:r>
-              <w:rPr>
-                <w:b w:val="0"/>
-                <w:color w:val="475569"/>
-                <w:sz w:val="16"/>
-              </w:rPr>
-              <w:t>IEEE Int. Conf. on Advanced Computing (ICAC 2026)</w:t>
+              <w:jc w:val="center"/>
+            </w:pPr>
+            <w:r>
+              <w:t>NIL</w:t>
             </w:r>
           </w:p>
         </w:tc>
@@ -3392,83 +3222,10 @@
           </w:tcPr>
           <w:p>
             <w:pPr>
-              <w:spacing w:before="20" w:after="20" w:line="276" w:lineRule="auto"/>
-              <w:jc w:val="left"/>
-            </w:pPr>
-            <w:r/>
-            <w:r>
-              <w:rPr>
-                <w:b/>
-                <w:color w:val="1E3A8A"/>
-                <w:sz w:val="16"/>
-              </w:rPr>
-              <w:t xml:space="preserve">Date: </w:t>
-            </w:r>
-            <w:r>
-              <w:rPr>
-                <w:b w:val="0"/>
-                <w:color w:val="334155"/>
-                <w:sz w:val="16"/>
-              </w:rPr>
-              <w:t>18-20 Sept 2026</w:t>
-            </w:r>
-          </w:p>
-          <w:p>
-            <w:pPr>
-              <w:spacing w:before="20" w:after="20" w:line="276" w:lineRule="auto"/>
-              <w:jc w:val="left"/>
-            </w:pPr>
-            <w:r>
-              <w:rPr>
-                <w:b/>
-                <w:color w:val="1E3A8A"/>
-                <w:sz w:val="16"/>
-              </w:rPr>
-              <w:t xml:space="preserve">Venue: </w:t>
-            </w:r>
-            <w:r>
-              <w:rPr>
-                <w:b w:val="0"/>
-                <w:color w:val="475569"/>
-                <w:sz w:val="16"/>
-              </w:rPr>
-              <w:t>Bangalore (Hybrid)</w:t>
-            </w:r>
-          </w:p>
-          <w:p>
-            <w:pPr>
-              <w:spacing w:before="20" w:after="20" w:line="276" w:lineRule="auto"/>
-              <w:jc w:val="left"/>
-            </w:pPr>
-            <w:r>
-              <w:rPr>
-                <w:b/>
-                <w:color w:val="1E3A8A"/>
-                <w:sz w:val="16"/>
-              </w:rPr>
-              <w:t xml:space="preserve">Indexed: </w:t>
-            </w:r>
-            <w:r>
-              <w:rPr>
-                <w:b/>
-                <w:color w:val="1E3A8A"/>
-                <w:sz w:val="16"/>
-              </w:rPr>
-              <w:t>Scopus &amp; WoS</w:t>
-            </w:r>
-          </w:p>
-          <w:p>
-            <w:pPr>
-              <w:spacing w:before="20" w:after="20" w:line="276" w:lineRule="auto"/>
-              <w:jc w:val="left"/>
-            </w:pPr>
-            <w:r>
-              <w:rPr>
-                <w:b w:val="0"/>
-                <w:color w:val="2563EB"/>
-                <w:sz w:val="16"/>
-              </w:rPr>
-              <w:t>https://icac2026.org/proceedings</w:t>
+              <w:jc w:val="center"/>
+            </w:pPr>
+            <w:r>
+              <w:t>NIL</w:t>
             </w:r>
           </w:p>
         </w:tc>
@@ -3640,7 +3397,7 @@
               <w:jc w:val="center"/>
             </w:pPr>
             <w:r>
-              <w:t>1</w:t>
+              <w:t>NIL</w:t>
             </w:r>
           </w:p>
         </w:tc>
@@ -3654,10 +3411,7 @@
               <w:jc w:val="center"/>
             </w:pPr>
             <w:r>
-              <w:rPr>
-                <w:b/>
-              </w:rPr>
-              <w:t>CSE</w:t>
+              <w:t>NIL</w:t>
             </w:r>
           </w:p>
         </w:tc>
@@ -3668,17 +3422,10 @@
           </w:tcPr>
           <w:p>
             <w:pPr>
-              <w:spacing w:before="20" w:after="20" w:line="276" w:lineRule="auto"/>
-              <w:jc w:val="left"/>
-            </w:pPr>
-            <w:r/>
-            <w:r>
-              <w:rPr>
-                <w:b w:val="0"/>
-                <w:color w:val="0F172A"/>
-                <w:sz w:val="17"/>
-              </w:rPr>
-              <w:t>Smart IoT-Based Automated Crop Health Monitoring System</w:t>
+              <w:jc w:val="center"/>
+            </w:pPr>
+            <w:r>
+              <w:t>NIL</w:t>
             </w:r>
           </w:p>
         </w:tc>
@@ -3689,69 +3436,10 @@
           </w:tcPr>
           <w:p>
             <w:pPr>
-              <w:spacing w:before="20" w:after="20" w:line="276" w:lineRule="auto"/>
-              <w:jc w:val="left"/>
-            </w:pPr>
-            <w:r/>
-            <w:r>
-              <w:rPr>
-                <w:b/>
-                <w:color w:val="1E3A8A"/>
-                <w:sz w:val="16"/>
-              </w:rPr>
-              <w:t xml:space="preserve">Inv: </w:t>
-            </w:r>
-            <w:r>
-              <w:rPr>
-                <w:b w:val="0"/>
-                <w:color w:val="334155"/>
-                <w:sz w:val="16"/>
-              </w:rPr>
-              <w:t>Dr. Vinod Kumar, Dr. Sreenivas Rao</w:t>
-            </w:r>
-          </w:p>
-          <w:p>
-            <w:pPr>
-              <w:spacing w:before="20" w:after="20" w:line="276" w:lineRule="auto"/>
-              <w:jc w:val="left"/>
-            </w:pPr>
-            <w:r>
-              <w:rPr>
-                <w:b/>
-                <w:color w:val="1E3A8A"/>
-                <w:sz w:val="16"/>
-              </w:rPr>
-              <w:t xml:space="preserve">App: </w:t>
-            </w:r>
-            <w:r>
-              <w:rPr>
-                <w:b w:val="0"/>
-                <w:color w:val="475569"/>
-                <w:sz w:val="16"/>
-              </w:rPr>
-              <w:t>Sanskrithi School of Engineering</w:t>
-            </w:r>
-          </w:p>
-          <w:p>
-            <w:pPr>
-              <w:spacing w:before="20" w:after="20" w:line="276" w:lineRule="auto"/>
-              <w:jc w:val="left"/>
-            </w:pPr>
-            <w:r>
-              <w:rPr>
-                <w:b/>
-                <w:color w:val="1E3A8A"/>
-                <w:sz w:val="16"/>
-              </w:rPr>
-              <w:t xml:space="preserve">Pat: </w:t>
-            </w:r>
-            <w:r>
-              <w:rPr>
-                <w:b w:val="0"/>
-                <w:color w:val="64748B"/>
-                <w:sz w:val="16"/>
-              </w:rPr>
-              <w:t>202641058912 A</w:t>
+              <w:jc w:val="center"/>
+            </w:pPr>
+            <w:r>
+              <w:t>NIL</w:t>
             </w:r>
           </w:p>
         </w:tc>
@@ -3762,31 +3450,10 @@
           </w:tcPr>
           <w:p>
             <w:pPr>
-              <w:spacing w:before="20" w:after="20" w:line="276" w:lineRule="auto"/>
-              <w:jc w:val="center"/>
-            </w:pPr>
-            <w:r/>
-            <w:r>
-              <w:rPr>
-                <w:b/>
-                <w:color w:val="1E3A8A"/>
-                <w:sz w:val="16"/>
-              </w:rPr>
-              <w:t>Published</w:t>
-            </w:r>
-          </w:p>
-          <w:p>
-            <w:pPr>
-              <w:spacing w:before="20" w:after="20" w:line="276" w:lineRule="auto"/>
-              <w:jc w:val="center"/>
-            </w:pPr>
-            <w:r>
-              <w:rPr>
-                <w:b w:val="0"/>
-                <w:color w:val="64748B"/>
-                <w:sz w:val="16"/>
-              </w:rPr>
-              <w:t>24 Sept 2026</w:t>
+              <w:jc w:val="center"/>
+            </w:pPr>
+            <w:r>
+              <w:t>NIL</w:t>
             </w:r>
           </w:p>
         </w:tc>
@@ -4820,11 +4487,12 @@
         </w:tblCellMar>
       </w:tblPr>
       <w:tblGrid>
-        <w:gridCol w:w="2074"/>
-        <w:gridCol w:w="2074"/>
-        <w:gridCol w:w="2074"/>
-        <w:gridCol w:w="2074"/>
-        <w:gridCol w:w="2074"/>
+        <w:gridCol w:w="1728"/>
+        <w:gridCol w:w="1728"/>
+        <w:gridCol w:w="1728"/>
+        <w:gridCol w:w="1728"/>
+        <w:gridCol w:w="1728"/>
+        <w:gridCol w:w="1728"/>
       </w:tblGrid>
       <w:tr>
         <w:trPr>
@@ -4869,7 +4537,7 @@
         </w:tc>
         <w:tc>
           <w:tcPr>
-            <w:tcW w:type="dxa" w:w="2592"/>
+            <w:tcW w:type="dxa" w:w="2160"/>
             <w:shd w:val="clear" w:color="auto" w:fill="1E3A8A"/>
           </w:tcPr>
           <w:p>
@@ -4887,7 +4555,7 @@
         </w:tc>
         <w:tc>
           <w:tcPr>
-            <w:tcW w:type="dxa" w:w="3456"/>
+            <w:tcW w:type="dxa" w:w="2592"/>
             <w:shd w:val="clear" w:color="auto" w:fill="1E3A8A"/>
           </w:tcPr>
           <w:p>
@@ -4905,7 +4573,25 @@
         </w:tc>
         <w:tc>
           <w:tcPr>
-            <w:tcW w:type="dxa" w:w="2808"/>
+            <w:tcW w:type="dxa" w:w="2160"/>
+            <w:shd w:val="clear" w:color="auto" w:fill="1E3A8A"/>
+          </w:tcPr>
+          <w:p>
+            <w:pPr>
+              <w:jc w:val="center"/>
+            </w:pPr>
+            <w:r>
+              <w:rPr>
+                <w:b/>
+                <w:color w:val="FFFFFF"/>
+              </w:rPr>
+              <w:t>Event / Competition</w:t>
+            </w:r>
+          </w:p>
+        </w:tc>
+        <w:tc>
+          <w:tcPr>
+            <w:tcW w:type="dxa" w:w="2664"/>
             <w:shd w:val="clear" w:color="auto" w:fill="1E3A8A"/>
           </w:tcPr>
           <w:p>
@@ -4956,6 +4642,20 @@
         </w:tc>
         <w:tc>
           <w:tcPr>
+            <w:tcW w:type="dxa" w:w="2160"/>
+            <w:shd w:val="clear" w:color="auto" w:fill="FFFFFF"/>
+          </w:tcPr>
+          <w:p>
+            <w:pPr>
+              <w:jc w:val="center"/>
+            </w:pPr>
+            <w:r>
+              <w:t>NIL</w:t>
+            </w:r>
+          </w:p>
+        </w:tc>
+        <w:tc>
+          <w:tcPr>
             <w:tcW w:type="dxa" w:w="2592"/>
             <w:shd w:val="clear" w:color="auto" w:fill="FFFFFF"/>
           </w:tcPr>
@@ -4970,7 +4670,7 @@
         </w:tc>
         <w:tc>
           <w:tcPr>
-            <w:tcW w:type="dxa" w:w="3456"/>
+            <w:tcW w:type="dxa" w:w="2160"/>
             <w:shd w:val="clear" w:color="auto" w:fill="FFFFFF"/>
           </w:tcPr>
           <w:p>
@@ -4984,7 +4684,7 @@
         </w:tc>
         <w:tc>
           <w:tcPr>
-            <w:tcW w:type="dxa" w:w="2808"/>
+            <w:tcW w:type="dxa" w:w="2664"/>
             <w:shd w:val="clear" w:color="auto" w:fill="FFFFFF"/>
           </w:tcPr>
           <w:p>

</xml_diff>